<commit_message>
updated section of the term paper
</commit_message>
<xml_diff>
--- a/term-paper/Курсовая.docx
+++ b/term-paper/Курсовая.docx
@@ -3819,7 +3819,43 @@
         <w:rPr>
           <w:rStyle w:val="NormalTok"/>
         </w:rPr>
-        <w:t xml:space="preserve">sns.boxplot(data</w:t>
+        <w:t xml:space="preserve">ax.hist(data[</w:t>
+      </w:r>
+      <w:r>
+        <w:rPr>
+          <w:rStyle w:val="StringTok"/>
+        </w:rPr>
+        <w:t xml:space="preserve">"price_rub"</w:t>
+      </w:r>
+      <w:r>
+        <w:rPr>
+          <w:rStyle w:val="NormalTok"/>
+        </w:rPr>
+        <w:t xml:space="preserve">] </w:t>
+      </w:r>
+      <w:r>
+        <w:rPr>
+          <w:rStyle w:val="OperatorTok"/>
+        </w:rPr>
+        <w:t xml:space="preserve">/</w:t>
+      </w:r>
+      <w:r>
+        <w:rPr>
+          <w:rStyle w:val="NormalTok"/>
+        </w:rPr>
+        <w:t xml:space="preserve"> </w:t>
+      </w:r>
+      <w:r>
+        <w:rPr>
+          <w:rStyle w:val="FloatTok"/>
+        </w:rPr>
+        <w:t xml:space="preserve">1e6</w:t>
+      </w:r>
+      <w:r>
+        <w:rPr>
+          <w:rStyle w:val="NormalTok"/>
+        </w:rPr>
+        <w:t xml:space="preserve">, bins</w:t>
       </w:r>
       <w:r>
         <w:rPr>
@@ -3829,9 +3865,15 @@
       </w:r>
       <w:r>
         <w:rPr>
-          <w:rStyle w:val="NormalTok"/>
-        </w:rPr>
-        <w:t xml:space="preserve">df_price, y</w:t>
+          <w:rStyle w:val="DecValTok"/>
+        </w:rPr>
+        <w:t xml:space="preserve">60</w:t>
+      </w:r>
+      <w:r>
+        <w:rPr>
+          <w:rStyle w:val="NormalTok"/>
+        </w:rPr>
+        <w:t xml:space="preserve">, color</w:t>
       </w:r>
       <w:r>
         <w:rPr>
@@ -3843,7 +3885,112 @@
         <w:rPr>
           <w:rStyle w:val="StringTok"/>
         </w:rPr>
-        <w:t xml:space="preserve">"price_rub"</w:t>
+        <w:t xml:space="preserve">"steelblue"</w:t>
+      </w:r>
+      <w:r>
+        <w:rPr>
+          <w:rStyle w:val="NormalTok"/>
+        </w:rPr>
+        <w:t xml:space="preserve">, edgecolor</w:t>
+      </w:r>
+      <w:r>
+        <w:rPr>
+          <w:rStyle w:val="OperatorTok"/>
+        </w:rPr>
+        <w:t xml:space="preserve">=</w:t>
+      </w:r>
+      <w:r>
+        <w:rPr>
+          <w:rStyle w:val="StringTok"/>
+        </w:rPr>
+        <w:t xml:space="preserve">"none"</w:t>
+      </w:r>
+      <w:r>
+        <w:rPr>
+          <w:rStyle w:val="NormalTok"/>
+        </w:rPr>
+        <w:t xml:space="preserve">)</w:t>
+      </w:r>
+      <w:r>
+        <w:br/>
+      </w:r>
+      <w:r>
+        <w:rPr>
+          <w:rStyle w:val="NormalTok"/>
+        </w:rPr>
+        <w:t xml:space="preserve">ax.axvline(right </w:t>
+      </w:r>
+      <w:r>
+        <w:rPr>
+          <w:rStyle w:val="OperatorTok"/>
+        </w:rPr>
+        <w:t xml:space="preserve">/</w:t>
+      </w:r>
+      <w:r>
+        <w:rPr>
+          <w:rStyle w:val="NormalTok"/>
+        </w:rPr>
+        <w:t xml:space="preserve"> </w:t>
+      </w:r>
+      <w:r>
+        <w:rPr>
+          <w:rStyle w:val="FloatTok"/>
+        </w:rPr>
+        <w:t xml:space="preserve">1e6</w:t>
+      </w:r>
+      <w:r>
+        <w:rPr>
+          <w:rStyle w:val="NormalTok"/>
+        </w:rPr>
+        <w:t xml:space="preserve">, color</w:t>
+      </w:r>
+      <w:r>
+        <w:rPr>
+          <w:rStyle w:val="OperatorTok"/>
+        </w:rPr>
+        <w:t xml:space="preserve">=</w:t>
+      </w:r>
+      <w:r>
+        <w:rPr>
+          <w:rStyle w:val="StringTok"/>
+        </w:rPr>
+        <w:t xml:space="preserve">"red"</w:t>
+      </w:r>
+      <w:r>
+        <w:rPr>
+          <w:rStyle w:val="NormalTok"/>
+        </w:rPr>
+        <w:t xml:space="preserve">, linewidth</w:t>
+      </w:r>
+      <w:r>
+        <w:rPr>
+          <w:rStyle w:val="OperatorTok"/>
+        </w:rPr>
+        <w:t xml:space="preserve">=</w:t>
+      </w:r>
+      <w:r>
+        <w:rPr>
+          <w:rStyle w:val="FloatTok"/>
+        </w:rPr>
+        <w:t xml:space="preserve">1.5</w:t>
+      </w:r>
+      <w:r>
+        <w:rPr>
+          <w:rStyle w:val="NormalTok"/>
+        </w:rPr>
+        <w:t xml:space="preserve">, linestyle</w:t>
+      </w:r>
+      <w:r>
+        <w:rPr>
+          <w:rStyle w:val="OperatorTok"/>
+        </w:rPr>
+        <w:t xml:space="preserve">=</w:t>
+      </w:r>
+      <w:r>
+        <w:rPr>
+          <w:rStyle w:val="StringTok"/>
+        </w:rPr>
+        <w:t xml:space="preserve">"--"</w:t>
       </w:r>
       <w:r>
         <w:rPr>
@@ -3859,9 +4006,9 @@
       <w:r>
         <w:drawing>
           <wp:inline>
-            <wp:extent cx="5320145" cy="3842327"/>
+            <wp:extent cx="6108700" cy="3452743"/>
             <wp:effectExtent b="0" l="0" r="0" t="0"/>
-            <wp:docPr descr="Ящик с усами: price_rub до фильтрации" title="" id="7" name="Picture"/>
+            <wp:docPr descr="Диаграмма размаха: price_rub до фильтрации" title="" id="7" name="Picture"/>
             <a:graphic>
               <a:graphicData uri="http://schemas.openxmlformats.org/drawingml/2006/picture">
                 <pic:pic>
@@ -3880,7 +4027,7 @@
                   <pic:spPr bwMode="auto">
                     <a:xfrm>
                       <a:off x="0" y="0"/>
-                      <a:ext cx="5320145" cy="3842327"/>
+                      <a:ext cx="6108700" cy="3452743"/>
                     </a:xfrm>
                     <a:prstGeom prst="rect">
                       <a:avLst/>
@@ -3904,7 +4051,7 @@
         <w:pStyle w:val="ImageCaption"/>
       </w:pPr>
       <w:r>
-        <w:t xml:space="preserve">Ящик с усами: price_rub до фильтрации</w:t>
+        <w:t xml:space="preserve">Диаграмма размаха: price_rub до фильтрации</w:t>
       </w:r>
     </w:p>
     <w:p>
@@ -3912,13 +4059,25 @@
         <w:pStyle w:val="BodyText"/>
       </w:pPr>
       <w:r>
-        <w:t xml:space="preserve">Отчётливо видны выбросы выше 50 млн руб., включая два экстремальных</w:t>
-      </w:r>
-      <w:r>
-        <w:t xml:space="preserve"> </w:t>
-      </w:r>
-      <w:r>
-        <w:t xml:space="preserve">значения (175 и 182 млн руб.).</w:t>
+        <w:t xml:space="preserve">Гистограмма показывает правостороннюю асимметрию распределения:</w:t>
+      </w:r>
+      <w:r>
+        <w:t xml:space="preserve"> </w:t>
+      </w:r>
+      <w:r>
+        <w:t xml:space="preserve">основная масса квартир сосредоточена в диапазоне 8–20 млн руб.,</w:t>
+      </w:r>
+      <w:r>
+        <w:t xml:space="preserve"> </w:t>
+      </w:r>
+      <w:r>
+        <w:t xml:space="preserve">хвост тянется до 34 млн. Красная пунктирная линия отмечает границу</w:t>
+      </w:r>
+      <w:r>
+        <w:t xml:space="preserve"> </w:t>
+      </w:r>
+      <w:r>
+        <w:t xml:space="preserve">фильтрации.</w:t>
       </w:r>
     </w:p>
     <w:p>
@@ -4088,7 +4247,7 @@
       <w:r>
         <w:drawing>
           <wp:inline>
-            <wp:extent cx="5237018" cy="3842327"/>
+            <wp:extent cx="6108700" cy="3452743"/>
             <wp:effectExtent b="0" l="0" r="0" t="0"/>
             <wp:docPr descr="После удаления по правилу 3σ" title="" id="8" name="Picture"/>
             <a:graphic>
@@ -4109,7 +4268,7 @@
                   <pic:spPr bwMode="auto">
                     <a:xfrm>
                       <a:off x="0" y="0"/>
-                      <a:ext cx="5237018" cy="3842327"/>
+                      <a:ext cx="6108700" cy="3452743"/>
                     </a:xfrm>
                     <a:prstGeom prst="rect">
                       <a:avLst/>
@@ -4138,6 +4297,26 @@
     </w:p>
     <w:p>
       <w:pPr>
+        <w:pStyle w:val="BodyText"/>
+      </w:pPr>
+      <w:r>
+        <w:t xml:space="preserve">Правило 3σ удалило лишь 14 записей (0,7%) — гистограмма практически</w:t>
+      </w:r>
+      <w:r>
+        <w:t xml:space="preserve"> </w:t>
+      </w:r>
+      <w:r>
+        <w:t xml:space="preserve">не изменилась. Метод предполагает нормальное распределение, поэтому</w:t>
+      </w:r>
+      <w:r>
+        <w:t xml:space="preserve"> </w:t>
+      </w:r>
+      <w:r>
+        <w:t xml:space="preserve">недостаточно чувствителен к правостороннему хвосту.</w:t>
+      </w:r>
+    </w:p>
+    <w:p>
+      <w:pPr>
         <w:pStyle w:val="SourceCode"/>
       </w:pPr>
       <w:r>
@@ -4268,6 +4447,12 @@
       </w:r>
       <w:r>
         <w:rPr>
+          <w:rStyle w:val="NormalTok"/>
+        </w:rPr>
+        <w:t xml:space="preserve"> </w:t>
+      </w:r>
+      <w:r>
+        <w:rPr>
           <w:rStyle w:val="OperatorTok"/>
         </w:rPr>
         <w:t xml:space="preserve">*</w:t>
@@ -4276,7 +4461,7 @@
         <w:rPr>
           <w:rStyle w:val="NormalTok"/>
         </w:rPr>
-        <w:t xml:space="preserve">(Q3</w:t>
+        <w:t xml:space="preserve"> (Q3 </w:t>
       </w:r>
       <w:r>
         <w:rPr>
@@ -4288,7 +4473,7 @@
         <w:rPr>
           <w:rStyle w:val="NormalTok"/>
         </w:rPr>
-        <w:t xml:space="preserve">Q1), Q3 </w:t>
+        <w:t xml:space="preserve"> Q1), Q3 </w:t>
       </w:r>
       <w:r>
         <w:rPr>
@@ -4310,6 +4495,12 @@
       </w:r>
       <w:r>
         <w:rPr>
+          <w:rStyle w:val="NormalTok"/>
+        </w:rPr>
+        <w:t xml:space="preserve"> </w:t>
+      </w:r>
+      <w:r>
+        <w:rPr>
           <w:rStyle w:val="OperatorTok"/>
         </w:rPr>
         <w:t xml:space="preserve">*</w:t>
@@ -4318,7 +4509,7 @@
         <w:rPr>
           <w:rStyle w:val="NormalTok"/>
         </w:rPr>
-        <w:t xml:space="preserve">(Q3</w:t>
+        <w:t xml:space="preserve"> (Q3 </w:t>
       </w:r>
       <w:r>
         <w:rPr>
@@ -4330,7 +4521,7 @@
         <w:rPr>
           <w:rStyle w:val="NormalTok"/>
         </w:rPr>
-        <w:t xml:space="preserve">Q1)</w:t>
+        <w:t xml:space="preserve"> Q1)</w:t>
       </w:r>
     </w:p>
     <w:p>
@@ -4360,7 +4551,7 @@
       <w:r>
         <w:drawing>
           <wp:inline>
-            <wp:extent cx="5237018" cy="3842327"/>
+            <wp:extent cx="6108700" cy="3452743"/>
             <wp:effectExtent b="0" l="0" r="0" t="0"/>
             <wp:docPr descr="После удаления по методу IQR" title="" id="9" name="Picture"/>
             <a:graphic>
@@ -4381,7 +4572,7 @@
                   <pic:spPr bwMode="auto">
                     <a:xfrm>
                       <a:off x="0" y="0"/>
-                      <a:ext cx="5237018" cy="3842327"/>
+                      <a:ext cx="6108700" cy="3452743"/>
                     </a:xfrm>
                     <a:prstGeom prst="rect">
                       <a:avLst/>
@@ -4413,19 +4604,19 @@
         <w:pStyle w:val="BodyText"/>
       </w:pPr>
       <w:r>
-        <w:t xml:space="preserve">IQR-метод строже (62 удалённых строки против 14), поскольку</w:t>
-      </w:r>
-      <w:r>
-        <w:t xml:space="preserve"> </w:t>
-      </w:r>
-      <w:r>
-        <w:t xml:space="preserve">распределение асимметрично. После IQR-фильтрации экстремальные</w:t>
-      </w:r>
-      <w:r>
-        <w:t xml:space="preserve"> </w:t>
-      </w:r>
-      <w:r>
-        <w:t xml:space="preserve">выбросы устранены.</w:t>
+        <w:t xml:space="preserve">IQR-метод строже (удалено 62 строки против 14) и не зависит от</w:t>
+      </w:r>
+      <w:r>
+        <w:t xml:space="preserve"> </w:t>
+      </w:r>
+      <w:r>
+        <w:t xml:space="preserve">формы распределения — граница 31,3 млн срезает правый хвост,</w:t>
+      </w:r>
+      <w:r>
+        <w:t xml:space="preserve"> </w:t>
+      </w:r>
+      <w:r>
+        <w:t xml:space="preserve">гистограмма приобретает более симметричный вид.</w:t>
       </w:r>
     </w:p>
     <w:bookmarkEnd w:id="13"/>
@@ -6745,10 +6936,10 @@
         <w:tblLook w:firstRow="1" w:lastRow="0" w:firstColumn="0" w:lastColumn="0" w:noHBand="0" w:noVBand="0" w:val="0020"/>
       </w:tblPr>
       <w:tblGrid>
-        <w:gridCol w:w="1980"/>
-        <w:gridCol w:w="1980"/>
-        <w:gridCol w:w="1980"/>
-        <w:gridCol w:w="1980"/>
+        <w:gridCol w:w="3508"/>
+        <w:gridCol w:w="2205"/>
+        <w:gridCol w:w="802"/>
+        <w:gridCol w:w="1403"/>
       </w:tblGrid>
       <w:tr>
         <w:trPr>
@@ -7529,7 +7720,7 @@
     </w:lvl>
   </w:abstractNum>
   <w:abstractNum w:abstractNumId="2">
-    <w:nsid w:val="023293E2"/>
+    <w:nsid w:val="0347A432"/>
     <w:multiLevelType w:val="multilevel"/>
     <w:lvl w:ilvl="0">
       <w:numFmt w:val="bullet"/>
@@ -7632,7 +7823,7 @@
     </w:lvl>
   </w:abstractNum>
   <w:abstractNum w:abstractNumId="3">
-    <w:nsid w:val="029CD37C"/>
+    <w:nsid w:val="050A8F4A"/>
     <w:multiLevelType w:val="multilevel"/>
     <w:lvl w:ilvl="0">
       <w:start w:val="1"/>

</xml_diff>